<commit_message>
Met à jour le planning du mardi (export semaine 1)
25 cours, 77 inscriptions, aucun cours ajouté ni supprimé. Deux
changements :
- « Groupe Rummens 2 » (15:30, Terrain 3) a désormais un moniteur :
  Armelle Tiokou, là où l'export précédent n'en indiquait aucun
- DAUBE HUETTEN Claudia quitte « Adultes débutants » (12:00, Terrain 2)

Les classements iClub ont également été rafraîchis. Huit fiches
moniteurs sont régénérées en conséquence.

Co-Authored-By: Claude Opus 5 <noreply@anthropic.com>
Claude-Session: https://claude.ai/code/session_01RsDkbcD3KwyPviDTcs72WZ
</commit_message>
<xml_diff>
--- a/Fiche_Armelle_Tiokou_2026-2027.docx
+++ b/Fiche_Armelle_Tiokou_2026-2027.docx
@@ -622,7 +622,547 @@
                 <w:sz w:val="16"/>
                 <w:szCs w:val="16"/>
               </w:rPr>
-              <w:t xml:space="preserve">   2023 · 3.6</w:t>
+              <w:t xml:space="preserve">   2023 · 3.7</w:t>
+            </w:r>
+          </w:p>
+        </w:tc>
+      </w:tr>
+    </w:tbl>
+    <w:p>
+      <w:pPr>
+        <w:spacing w:after="190" w:before="0" w:line="250"/>
+      </w:pPr>
+      <w:r>
+        <w:rPr>
+          <w:rFonts w:ascii="Calibri" w:cs="Calibri" w:eastAsia="Calibri" w:hAnsi="Calibri"/>
+          <w:color w:val="2E2E2E"/>
+          <w:sz w:val="10"/>
+          <w:szCs w:val="10"/>
+        </w:rPr>
+        <w:t xml:space="preserve"/>
+      </w:r>
+    </w:p>
+    <w:p>
+      <w:r>
+        <w:br w:type="page"/>
+      </w:r>
+    </w:p>
+    <w:tbl>
+      <w:tblPr>
+        <w:tblW w:type="dxa" w:w="9637"/>
+        <w:tblBorders>
+          <w:top w:val="none" w:color="FFFFFF" w:sz="0"/>
+          <w:left w:val="none" w:color="FFFFFF" w:sz="0"/>
+          <w:bottom w:val="none" w:color="FFFFFF" w:sz="0"/>
+          <w:right w:val="none" w:color="FFFFFF" w:sz="0"/>
+          <w:insideH w:val="none" w:color="FFFFFF" w:sz="0"/>
+          <w:insideV w:val="none" w:color="FFFFFF" w:sz="0"/>
+        </w:tblBorders>
+      </w:tblPr>
+      <w:tblGrid>
+        <w:gridCol w:w="3855"/>
+        <w:gridCol w:w="5782"/>
+      </w:tblGrid>
+      <w:tr>
+        <w:tc>
+          <w:tcPr>
+            <w:tcW w:type="dxa" w:w="3855"/>
+            <w:tcMar>
+              <w:top w:type="dxa" w:w="0"/>
+              <w:left w:type="dxa" w:w="0"/>
+              <w:bottom w:type="dxa" w:w="0"/>
+              <w:right w:type="dxa" w:w="170"/>
+            </w:tcMar>
+            <w:vAlign w:val="center"/>
+          </w:tcPr>
+          <w:p>
+            <w:pPr>
+              <w:spacing w:after="0"/>
+            </w:pPr>
+            <w:r>
+              <w:drawing>
+                <wp:inline distT="0" distB="0" distL="0" distR="0">
+                  <wp:extent cx="1619250" cy="457200"/>
+                  <wp:effectExtent t="0" r="0" b="0" l="0"/>
+                  <wp:docPr id="1" name="" descr="" title=""/>
+                  <wp:cNvGraphicFramePr>
+                    <a:graphicFrameLocks xmlns:a="http://schemas.openxmlformats.org/drawingml/2006/main" noChangeAspect="1"/>
+                  </wp:cNvGraphicFramePr>
+                  <a:graphic xmlns:a="http://schemas.openxmlformats.org/drawingml/2006/main">
+                    <a:graphicData uri="http://schemas.openxmlformats.org/drawingml/2006/picture">
+                      <pic:pic xmlns:pic="http://schemas.openxmlformats.org/drawingml/2006/picture">
+                        <pic:nvPicPr>
+                          <pic:cNvPr id="0" name="" descr=""/>
+                          <pic:cNvPicPr>
+                            <a:picLocks noChangeAspect="1" noChangeArrowheads="1"/>
+                          </pic:cNvPicPr>
+                        </pic:nvPicPr>
+                        <pic:blipFill>
+                          <a:blip r:embed="rId8" cstate="none"/>
+                          <a:srcRect/>
+                          <a:stretch>
+                            <a:fillRect/>
+                          </a:stretch>
+                        </pic:blipFill>
+                        <pic:spPr bwMode="auto">
+                          <a:xfrm>
+                            <a:off x="0" y="0"/>
+                            <a:ext cx="1619250" cy="457200"/>
+                          </a:xfrm>
+                          <a:prstGeom prst="rect">
+                            <a:avLst/>
+                          </a:prstGeom>
+                        </pic:spPr>
+                      </pic:pic>
+                    </a:graphicData>
+                  </a:graphic>
+                </wp:inline>
+              </w:drawing>
+            </w:r>
+          </w:p>
+        </w:tc>
+        <w:tc>
+          <w:tcPr>
+            <w:tcW w:type="dxa" w:w="5782"/>
+            <w:tcMar>
+              <w:top w:type="dxa" w:w="0"/>
+              <w:left w:type="dxa" w:w="170"/>
+              <w:bottom w:type="dxa" w:w="0"/>
+              <w:right w:type="dxa" w:w="0"/>
+            </w:tcMar>
+            <w:vAlign w:val="center"/>
+          </w:tcPr>
+          <w:p>
+            <w:pPr>
+              <w:spacing w:after="20" w:before="0" w:line="250"/>
+              <w:jc w:val="right"/>
+            </w:pPr>
+            <w:r>
+              <w:rPr>
+                <w:rFonts w:ascii="Calibri" w:cs="Calibri" w:eastAsia="Calibri" w:hAnsi="Calibri"/>
+                <w:b/>
+                <w:bCs/>
+                <w:color w:val="C0392B"/>
+                <w:sz w:val="30"/>
+                <w:szCs w:val="30"/>
+              </w:rPr>
+              <w:t xml:space="preserve">ARMELLE TIOKOU</w:t>
+            </w:r>
+          </w:p>
+          <w:p>
+            <w:pPr>
+              <w:spacing w:after="0" w:before="0" w:line="230"/>
+              <w:jc w:val="right"/>
+            </w:pPr>
+            <w:r>
+              <w:rPr>
+                <w:rFonts w:ascii="Calibri" w:cs="Calibri" w:eastAsia="Calibri" w:hAnsi="Calibri"/>
+                <w:i/>
+                <w:iCs/>
+                <w:color w:val="6E6E6E"/>
+                <w:sz w:val="18"/>
+                <w:szCs w:val="18"/>
+              </w:rPr>
+              <w:t xml:space="preserve">Saison 2026-2027</w:t>
+            </w:r>
+          </w:p>
+        </w:tc>
+      </w:tr>
+    </w:tbl>
+    <w:p>
+      <w:pPr>
+        <w:pBdr>
+          <w:bottom w:val="single" w:color="8A9E28" w:sz="8" w:space="5"/>
+        </w:pBdr>
+        <w:spacing w:after="140" w:before="0" w:line="250"/>
+      </w:pPr>
+      <w:r>
+        <w:rPr>
+          <w:rFonts w:ascii="Calibri" w:cs="Calibri" w:eastAsia="Calibri" w:hAnsi="Calibri"/>
+          <w:color w:val="2E2E2E"/>
+          <w:sz w:val="6"/>
+          <w:szCs w:val="6"/>
+        </w:rPr>
+        <w:t xml:space="preserve"/>
+      </w:r>
+    </w:p>
+    <w:tbl>
+      <w:tblPr>
+        <w:tblW w:type="dxa" w:w="9637"/>
+        <w:tblBorders>
+          <w:top w:val="none" w:color="FFFFFF" w:sz="0"/>
+          <w:left w:val="none" w:color="FFFFFF" w:sz="0"/>
+          <w:bottom w:val="none" w:color="FFFFFF" w:sz="0"/>
+          <w:right w:val="none" w:color="FFFFFF" w:sz="0"/>
+          <w:insideH w:val="none" w:color="FFFFFF" w:sz="0"/>
+          <w:insideV w:val="none" w:color="FFFFFF" w:sz="0"/>
+        </w:tblBorders>
+      </w:tblPr>
+      <w:tblGrid>
+        <w:gridCol w:w="4818"/>
+        <w:gridCol w:w="4818"/>
+      </w:tblGrid>
+      <w:tr>
+        <w:tc>
+          <w:tcPr>
+            <w:tcW w:type="dxa" w:w="4818"/>
+            <w:tcMar>
+              <w:top w:type="dxa" w:w="0"/>
+              <w:left w:type="dxa" w:w="0"/>
+              <w:bottom w:type="dxa" w:w="0"/>
+              <w:right w:type="dxa" w:w="0"/>
+            </w:tcMar>
+            <w:vAlign w:val="center"/>
+          </w:tcPr>
+          <w:p>
+            <w:pPr>
+              <w:spacing w:after="0" w:before="0" w:line="280"/>
+            </w:pPr>
+            <w:r>
+              <w:rPr>
+                <w:rFonts w:ascii="Calibri" w:cs="Calibri" w:eastAsia="Calibri" w:hAnsi="Calibri"/>
+                <w:b/>
+                <w:bCs/>
+                <w:color w:val="8A9E28"/>
+                <w:sz w:val="34"/>
+                <w:szCs w:val="34"/>
+              </w:rPr>
+              <w:t xml:space="preserve">Mardi</w:t>
+            </w:r>
+          </w:p>
+        </w:tc>
+        <w:tc>
+          <w:tcPr>
+            <w:tcW w:type="dxa" w:w="4818"/>
+            <w:tcMar>
+              <w:top w:type="dxa" w:w="0"/>
+              <w:left w:type="dxa" w:w="0"/>
+              <w:bottom w:type="dxa" w:w="0"/>
+              <w:right w:type="dxa" w:w="0"/>
+            </w:tcMar>
+            <w:vAlign w:val="center"/>
+          </w:tcPr>
+          <w:p>
+            <w:pPr>
+              <w:spacing w:after="0" w:before="0" w:line="250"/>
+              <w:jc w:val="right"/>
+            </w:pPr>
+            <w:r>
+              <w:rPr>
+                <w:rFonts w:ascii="Calibri" w:cs="Calibri" w:eastAsia="Calibri" w:hAnsi="Calibri"/>
+                <w:color w:val="6E6E6E"/>
+                <w:sz w:val="19"/>
+                <w:szCs w:val="19"/>
+              </w:rPr>
+              <w:t xml:space="preserve">1 cours   ·   1 h   ·   4 élèves</w:t>
+            </w:r>
+          </w:p>
+        </w:tc>
+      </w:tr>
+    </w:tbl>
+    <w:p>
+      <w:pPr>
+        <w:spacing w:after="200" w:before="0" w:line="250"/>
+      </w:pPr>
+      <w:r>
+        <w:rPr>
+          <w:rFonts w:ascii="Calibri" w:cs="Calibri" w:eastAsia="Calibri" w:hAnsi="Calibri"/>
+          <w:color w:val="2E2E2E"/>
+          <w:sz w:val="8"/>
+          <w:szCs w:val="8"/>
+        </w:rPr>
+        <w:t xml:space="preserve"/>
+      </w:r>
+    </w:p>
+    <w:tbl>
+      <w:tblPr>
+        <w:tblW w:type="dxa" w:w="9637"/>
+        <w:tblBorders>
+          <w:top w:val="none" w:color="FFFFFF" w:sz="0"/>
+          <w:left w:val="none" w:color="FFFFFF" w:sz="0"/>
+          <w:bottom w:val="none" w:color="FFFFFF" w:sz="0"/>
+          <w:right w:val="none" w:color="FFFFFF" w:sz="0"/>
+          <w:insideH w:val="none" w:color="FFFFFF" w:sz="0"/>
+          <w:insideV w:val="none" w:color="FFFFFF" w:sz="0"/>
+        </w:tblBorders>
+      </w:tblPr>
+      <w:tblGrid>
+        <w:gridCol w:w="9637"/>
+      </w:tblGrid>
+      <w:tr>
+        <w:tc>
+          <w:tcPr>
+            <w:tcW w:type="dxa" w:w="9637"/>
+            <w:shd w:fill="8A9E28" w:color="auto" w:val="clear"/>
+            <w:tcMar>
+              <w:top w:type="dxa" w:w="85"/>
+              <w:left w:type="dxa" w:w="170"/>
+              <w:bottom w:type="dxa" w:w="85"/>
+              <w:right w:type="dxa" w:w="170"/>
+            </w:tcMar>
+            <w:vAlign w:val="center"/>
+          </w:tcPr>
+          <w:p>
+            <w:pPr>
+              <w:spacing w:after="0" w:before="0" w:line="250"/>
+            </w:pPr>
+            <w:r>
+              <w:rPr>
+                <w:rFonts w:ascii="Calibri" w:cs="Calibri" w:eastAsia="Calibri" w:hAnsi="Calibri"/>
+                <w:b/>
+                <w:bCs/>
+                <w:color w:val="FFFFFF"/>
+                <w:sz w:val="22"/>
+                <w:szCs w:val="22"/>
+              </w:rPr>
+              <w:t xml:space="preserve">15:30 – 16:30</w:t>
+            </w:r>
+            <w:r>
+              <w:rPr>
+                <w:rFonts w:ascii="Calibri" w:cs="Calibri" w:eastAsia="Calibri" w:hAnsi="Calibri"/>
+                <w:color w:val="FFFFFF"/>
+                <w:sz w:val="19"/>
+                <w:szCs w:val="19"/>
+              </w:rPr>
+              <w:t xml:space="preserve">      Terrain 3</w:t>
+            </w:r>
+            <w:r>
+              <w:rPr>
+                <w:rFonts w:ascii="Calibri" w:cs="Calibri" w:eastAsia="Calibri" w:hAnsi="Calibri"/>
+                <w:b/>
+                <w:bCs/>
+                <w:color w:val="FFFFFF"/>
+                <w:sz w:val="22"/>
+                <w:szCs w:val="22"/>
+              </w:rPr>
+              <w:t xml:space="preserve">      Groupe Rummens 2</w:t>
+            </w:r>
+          </w:p>
+        </w:tc>
+      </w:tr>
+    </w:tbl>
+    <w:tbl>
+      <w:tblPr>
+        <w:tblW w:type="dxa" w:w="9637"/>
+        <w:tblBorders>
+          <w:top w:val="none" w:color="FFFFFF" w:sz="0"/>
+          <w:left w:val="none" w:color="FFFFFF" w:sz="0"/>
+          <w:bottom w:val="none" w:color="FFFFFF" w:sz="0"/>
+          <w:right w:val="none" w:color="FFFFFF" w:sz="0"/>
+          <w:insideH w:val="none" w:color="FFFFFF" w:sz="0"/>
+          <w:insideV w:val="none" w:color="FFFFFF" w:sz="0"/>
+        </w:tblBorders>
+      </w:tblPr>
+      <w:tblGrid>
+        <w:gridCol w:w="4818"/>
+        <w:gridCol w:w="4818"/>
+      </w:tblGrid>
+      <w:tr>
+        <w:trPr>
+          <w:trHeight w:val="317" w:hRule="atLeast"/>
+        </w:trPr>
+        <w:tc>
+          <w:tcPr>
+            <w:tcW w:type="dxa" w:w="4818"/>
+            <w:tcBorders>
+              <w:top w:val="none" w:color="FFFFFF" w:sz="0"/>
+              <w:left w:val="none" w:color="FFFFFF" w:sz="0"/>
+              <w:bottom w:val="none" w:color="FFFFFF" w:sz="0"/>
+              <w:right w:val="none" w:color="FFFFFF" w:sz="0"/>
+            </w:tcBorders>
+            <w:tcMar>
+              <w:top w:type="dxa" w:w="34"/>
+              <w:left w:type="dxa" w:w="226"/>
+              <w:bottom w:type="dxa" w:w="34"/>
+              <w:right w:type="dxa" w:w="113"/>
+            </w:tcMar>
+            <w:vAlign w:val="center"/>
+          </w:tcPr>
+          <w:p>
+            <w:pPr>
+              <w:spacing w:after="0" w:before="0" w:line="220"/>
+            </w:pPr>
+            <w:r>
+              <w:rPr>
+                <w:rFonts w:ascii="Calibri" w:cs="Calibri" w:eastAsia="Calibri" w:hAnsi="Calibri"/>
+                <w:color w:val="AAAAAA"/>
+                <w:sz w:val="17"/>
+                <w:szCs w:val="17"/>
+              </w:rPr>
+              <w:t xml:space="preserve">01.  </w:t>
+            </w:r>
+            <w:r>
+              <w:rPr>
+                <w:rFonts w:ascii="Calibri" w:cs="Calibri" w:eastAsia="Calibri" w:hAnsi="Calibri"/>
+                <w:color w:val="2E2E2E"/>
+                <w:sz w:val="19"/>
+                <w:szCs w:val="19"/>
+              </w:rPr>
+              <w:t xml:space="preserve">DAUBIGNY Quentin</w:t>
+            </w:r>
+            <w:r>
+              <w:rPr>
+                <w:rFonts w:ascii="Calibri" w:cs="Calibri" w:eastAsia="Calibri" w:hAnsi="Calibri"/>
+                <w:color w:val="6E6E6E"/>
+                <w:sz w:val="16"/>
+                <w:szCs w:val="16"/>
+              </w:rPr>
+              <w:t xml:space="preserve">   2018 · 8</w:t>
+            </w:r>
+          </w:p>
+        </w:tc>
+        <w:tc>
+          <w:tcPr>
+            <w:tcW w:type="dxa" w:w="4818"/>
+            <w:tcBorders>
+              <w:top w:val="none" w:color="FFFFFF" w:sz="0"/>
+              <w:left w:val="none" w:color="FFFFFF" w:sz="0"/>
+              <w:bottom w:val="none" w:color="FFFFFF" w:sz="0"/>
+              <w:right w:val="none" w:color="FFFFFF" w:sz="0"/>
+            </w:tcBorders>
+            <w:tcMar>
+              <w:top w:type="dxa" w:w="34"/>
+              <w:left w:type="dxa" w:w="226"/>
+              <w:bottom w:type="dxa" w:w="34"/>
+              <w:right w:type="dxa" w:w="113"/>
+            </w:tcMar>
+            <w:vAlign w:val="center"/>
+          </w:tcPr>
+          <w:p>
+            <w:pPr>
+              <w:spacing w:after="0" w:before="0" w:line="220"/>
+            </w:pPr>
+            <w:r>
+              <w:rPr>
+                <w:rFonts w:ascii="Calibri" w:cs="Calibri" w:eastAsia="Calibri" w:hAnsi="Calibri"/>
+                <w:color w:val="AAAAAA"/>
+                <w:sz w:val="17"/>
+                <w:szCs w:val="17"/>
+              </w:rPr>
+              <w:t xml:space="preserve">03.  </w:t>
+            </w:r>
+            <w:r>
+              <w:rPr>
+                <w:rFonts w:ascii="Calibri" w:cs="Calibri" w:eastAsia="Calibri" w:hAnsi="Calibri"/>
+                <w:color w:val="2E2E2E"/>
+                <w:sz w:val="19"/>
+                <w:szCs w:val="19"/>
+              </w:rPr>
+              <w:t xml:space="preserve">MÉLIGNON Zélie</w:t>
+            </w:r>
+            <w:r>
+              <w:rPr>
+                <w:rFonts w:ascii="Calibri" w:cs="Calibri" w:eastAsia="Calibri" w:hAnsi="Calibri"/>
+                <w:color w:val="6E6E6E"/>
+                <w:sz w:val="16"/>
+                <w:szCs w:val="16"/>
+              </w:rPr>
+              <w:t xml:space="preserve">   2018 · 8</w:t>
+            </w:r>
+          </w:p>
+        </w:tc>
+      </w:tr>
+      <w:tr>
+        <w:trPr>
+          <w:trHeight w:val="317" w:hRule="atLeast"/>
+        </w:trPr>
+        <w:tc>
+          <w:tcPr>
+            <w:tcW w:type="dxa" w:w="4818"/>
+            <w:tcBorders>
+              <w:top w:val="none" w:color="FFFFFF" w:sz="0"/>
+              <w:left w:val="none" w:color="FFFFFF" w:sz="0"/>
+              <w:bottom w:val="none" w:color="FFFFFF" w:sz="0"/>
+              <w:right w:val="none" w:color="FFFFFF" w:sz="0"/>
+            </w:tcBorders>
+            <w:tcMar>
+              <w:top w:type="dxa" w:w="34"/>
+              <w:left w:type="dxa" w:w="226"/>
+              <w:bottom w:type="dxa" w:w="34"/>
+              <w:right w:type="dxa" w:w="113"/>
+            </w:tcMar>
+            <w:vAlign w:val="center"/>
+          </w:tcPr>
+          <w:p>
+            <w:pPr>
+              <w:spacing w:after="0" w:before="0" w:line="220"/>
+            </w:pPr>
+            <w:r>
+              <w:rPr>
+                <w:rFonts w:ascii="Calibri" w:cs="Calibri" w:eastAsia="Calibri" w:hAnsi="Calibri"/>
+                <w:color w:val="AAAAAA"/>
+                <w:sz w:val="17"/>
+                <w:szCs w:val="17"/>
+              </w:rPr>
+              <w:t xml:space="preserve">02.  </w:t>
+            </w:r>
+            <w:r>
+              <w:rPr>
+                <w:rFonts w:ascii="Calibri" w:cs="Calibri" w:eastAsia="Calibri" w:hAnsi="Calibri"/>
+                <w:color w:val="2E2E2E"/>
+                <w:sz w:val="19"/>
+                <w:szCs w:val="19"/>
+              </w:rPr>
+              <w:t xml:space="preserve">D'HOOGHE Mila</w:t>
+            </w:r>
+            <w:r>
+              <w:rPr>
+                <w:rFonts w:ascii="Calibri" w:cs="Calibri" w:eastAsia="Calibri" w:hAnsi="Calibri"/>
+                <w:color w:val="6E6E6E"/>
+                <w:sz w:val="16"/>
+                <w:szCs w:val="16"/>
+              </w:rPr>
+              <w:t xml:space="preserve">   2018 · 7.9</w:t>
+            </w:r>
+          </w:p>
+        </w:tc>
+        <w:tc>
+          <w:tcPr>
+            <w:tcW w:type="dxa" w:w="4818"/>
+            <w:tcBorders>
+              <w:top w:val="none" w:color="FFFFFF" w:sz="0"/>
+              <w:left w:val="none" w:color="FFFFFF" w:sz="0"/>
+              <w:bottom w:val="none" w:color="FFFFFF" w:sz="0"/>
+              <w:right w:val="none" w:color="FFFFFF" w:sz="0"/>
+            </w:tcBorders>
+            <w:tcMar>
+              <w:top w:type="dxa" w:w="34"/>
+              <w:left w:type="dxa" w:w="226"/>
+              <w:bottom w:type="dxa" w:w="34"/>
+              <w:right w:type="dxa" w:w="113"/>
+            </w:tcMar>
+            <w:vAlign w:val="center"/>
+          </w:tcPr>
+          <w:p>
+            <w:pPr>
+              <w:spacing w:after="0" w:before="0" w:line="220"/>
+            </w:pPr>
+            <w:r>
+              <w:rPr>
+                <w:rFonts w:ascii="Calibri" w:cs="Calibri" w:eastAsia="Calibri" w:hAnsi="Calibri"/>
+                <w:color w:val="AAAAAA"/>
+                <w:sz w:val="17"/>
+                <w:szCs w:val="17"/>
+              </w:rPr>
+              <w:t xml:space="preserve">04.  </w:t>
+            </w:r>
+            <w:r>
+              <w:rPr>
+                <w:rFonts w:ascii="Calibri" w:cs="Calibri" w:eastAsia="Calibri" w:hAnsi="Calibri"/>
+                <w:color w:val="2E2E2E"/>
+                <w:sz w:val="19"/>
+                <w:szCs w:val="19"/>
+              </w:rPr>
+              <w:t xml:space="preserve">RENARDY Léon</w:t>
+            </w:r>
+            <w:r>
+              <w:rPr>
+                <w:rFonts w:ascii="Calibri" w:cs="Calibri" w:eastAsia="Calibri" w:hAnsi="Calibri"/>
+                <w:color w:val="6E6E6E"/>
+                <w:sz w:val="16"/>
+                <w:szCs w:val="16"/>
+              </w:rPr>
+              <w:t xml:space="preserve">   2018 · 8.4</w:t>
             </w:r>
           </w:p>
         </w:tc>
@@ -1355,7 +1895,7 @@
         <w:sz w:val="15"/>
         <w:szCs w:val="15"/>
       </w:rPr>
-      <w:t xml:space="preserve">Armelle Tiokou  ·  2 cours  ·  2 h par semaine  ·  Saison 2026-2027</w:t>
+      <w:t xml:space="preserve">Armelle Tiokou  ·  3 cours  ·  3 h par semaine  ·  Saison 2026-2027</w:t>
     </w:r>
   </w:p>
 </w:ftr>

</xml_diff>

<commit_message>
Met à jour le planning du mercredi (export semaine 1)
38 cours, 131 inscriptions, aucun cours ajouté ni supprimé. Trois
changements :
- « Bleu - Rouge » (15:00, Terrain 1) passe d'Armelle Tiokou à
  Jérémie Saoul
- RIBEIRO FERINI Mathias rejoint « Orange - vert débutants » (12:30)
- RIEKELES Eva rejoint « Orange - Vert » (14:00, Terrain 1)

Onze fiches moniteurs sont régénérées en conséquence.

Co-Authored-By: Claude Opus 5 <noreply@anthropic.com>
Claude-Session: https://claude.ai/code/session_01RsDkbcD3KwyPviDTcs72WZ
</commit_message>
<xml_diff>
--- a/Fiche_Armelle_Tiokou_2026-2027.docx
+++ b/Fiche_Armelle_Tiokou_2026-2027.docx
@@ -1182,651 +1182,6 @@
         <w:t xml:space="preserve"/>
       </w:r>
     </w:p>
-    <w:p>
-      <w:r>
-        <w:br w:type="page"/>
-      </w:r>
-    </w:p>
-    <w:tbl>
-      <w:tblPr>
-        <w:tblW w:type="dxa" w:w="9637"/>
-        <w:tblBorders>
-          <w:top w:val="none" w:color="FFFFFF" w:sz="0"/>
-          <w:left w:val="none" w:color="FFFFFF" w:sz="0"/>
-          <w:bottom w:val="none" w:color="FFFFFF" w:sz="0"/>
-          <w:right w:val="none" w:color="FFFFFF" w:sz="0"/>
-          <w:insideH w:val="none" w:color="FFFFFF" w:sz="0"/>
-          <w:insideV w:val="none" w:color="FFFFFF" w:sz="0"/>
-        </w:tblBorders>
-      </w:tblPr>
-      <w:tblGrid>
-        <w:gridCol w:w="3855"/>
-        <w:gridCol w:w="5782"/>
-      </w:tblGrid>
-      <w:tr>
-        <w:tc>
-          <w:tcPr>
-            <w:tcW w:type="dxa" w:w="3855"/>
-            <w:tcMar>
-              <w:top w:type="dxa" w:w="0"/>
-              <w:left w:type="dxa" w:w="0"/>
-              <w:bottom w:type="dxa" w:w="0"/>
-              <w:right w:type="dxa" w:w="170"/>
-            </w:tcMar>
-            <w:vAlign w:val="center"/>
-          </w:tcPr>
-          <w:p>
-            <w:pPr>
-              <w:spacing w:after="0"/>
-            </w:pPr>
-            <w:r>
-              <w:drawing>
-                <wp:inline distT="0" distB="0" distL="0" distR="0">
-                  <wp:extent cx="1619250" cy="457200"/>
-                  <wp:effectExtent t="0" r="0" b="0" l="0"/>
-                  <wp:docPr id="1" name="" descr="" title=""/>
-                  <wp:cNvGraphicFramePr>
-                    <a:graphicFrameLocks xmlns:a="http://schemas.openxmlformats.org/drawingml/2006/main" noChangeAspect="1"/>
-                  </wp:cNvGraphicFramePr>
-                  <a:graphic xmlns:a="http://schemas.openxmlformats.org/drawingml/2006/main">
-                    <a:graphicData uri="http://schemas.openxmlformats.org/drawingml/2006/picture">
-                      <pic:pic xmlns:pic="http://schemas.openxmlformats.org/drawingml/2006/picture">
-                        <pic:nvPicPr>
-                          <pic:cNvPr id="0" name="" descr=""/>
-                          <pic:cNvPicPr>
-                            <a:picLocks noChangeAspect="1" noChangeArrowheads="1"/>
-                          </pic:cNvPicPr>
-                        </pic:nvPicPr>
-                        <pic:blipFill>
-                          <a:blip r:embed="rId8" cstate="none"/>
-                          <a:srcRect/>
-                          <a:stretch>
-                            <a:fillRect/>
-                          </a:stretch>
-                        </pic:blipFill>
-                        <pic:spPr bwMode="auto">
-                          <a:xfrm>
-                            <a:off x="0" y="0"/>
-                            <a:ext cx="1619250" cy="457200"/>
-                          </a:xfrm>
-                          <a:prstGeom prst="rect">
-                            <a:avLst/>
-                          </a:prstGeom>
-                        </pic:spPr>
-                      </pic:pic>
-                    </a:graphicData>
-                  </a:graphic>
-                </wp:inline>
-              </w:drawing>
-            </w:r>
-          </w:p>
-        </w:tc>
-        <w:tc>
-          <w:tcPr>
-            <w:tcW w:type="dxa" w:w="5782"/>
-            <w:tcMar>
-              <w:top w:type="dxa" w:w="0"/>
-              <w:left w:type="dxa" w:w="170"/>
-              <w:bottom w:type="dxa" w:w="0"/>
-              <w:right w:type="dxa" w:w="0"/>
-            </w:tcMar>
-            <w:vAlign w:val="center"/>
-          </w:tcPr>
-          <w:p>
-            <w:pPr>
-              <w:spacing w:after="20" w:before="0" w:line="250"/>
-              <w:jc w:val="right"/>
-            </w:pPr>
-            <w:r>
-              <w:rPr>
-                <w:rFonts w:ascii="Calibri" w:cs="Calibri" w:eastAsia="Calibri" w:hAnsi="Calibri"/>
-                <w:b/>
-                <w:bCs/>
-                <w:color w:val="C0392B"/>
-                <w:sz w:val="30"/>
-                <w:szCs w:val="30"/>
-              </w:rPr>
-              <w:t xml:space="preserve">ARMELLE TIOKOU</w:t>
-            </w:r>
-          </w:p>
-          <w:p>
-            <w:pPr>
-              <w:spacing w:after="0" w:before="0" w:line="230"/>
-              <w:jc w:val="right"/>
-            </w:pPr>
-            <w:r>
-              <w:rPr>
-                <w:rFonts w:ascii="Calibri" w:cs="Calibri" w:eastAsia="Calibri" w:hAnsi="Calibri"/>
-                <w:i/>
-                <w:iCs/>
-                <w:color w:val="6E6E6E"/>
-                <w:sz w:val="18"/>
-                <w:szCs w:val="18"/>
-              </w:rPr>
-              <w:t xml:space="preserve">Saison 2026-2027</w:t>
-            </w:r>
-          </w:p>
-        </w:tc>
-      </w:tr>
-    </w:tbl>
-    <w:p>
-      <w:pPr>
-        <w:pBdr>
-          <w:bottom w:val="single" w:color="8A9E28" w:sz="8" w:space="5"/>
-        </w:pBdr>
-        <w:spacing w:after="140" w:before="0" w:line="250"/>
-      </w:pPr>
-      <w:r>
-        <w:rPr>
-          <w:rFonts w:ascii="Calibri" w:cs="Calibri" w:eastAsia="Calibri" w:hAnsi="Calibri"/>
-          <w:color w:val="2E2E2E"/>
-          <w:sz w:val="6"/>
-          <w:szCs w:val="6"/>
-        </w:rPr>
-        <w:t xml:space="preserve"/>
-      </w:r>
-    </w:p>
-    <w:tbl>
-      <w:tblPr>
-        <w:tblW w:type="dxa" w:w="9637"/>
-        <w:tblBorders>
-          <w:top w:val="none" w:color="FFFFFF" w:sz="0"/>
-          <w:left w:val="none" w:color="FFFFFF" w:sz="0"/>
-          <w:bottom w:val="none" w:color="FFFFFF" w:sz="0"/>
-          <w:right w:val="none" w:color="FFFFFF" w:sz="0"/>
-          <w:insideH w:val="none" w:color="FFFFFF" w:sz="0"/>
-          <w:insideV w:val="none" w:color="FFFFFF" w:sz="0"/>
-        </w:tblBorders>
-      </w:tblPr>
-      <w:tblGrid>
-        <w:gridCol w:w="4818"/>
-        <w:gridCol w:w="4818"/>
-      </w:tblGrid>
-      <w:tr>
-        <w:tc>
-          <w:tcPr>
-            <w:tcW w:type="dxa" w:w="4818"/>
-            <w:tcMar>
-              <w:top w:type="dxa" w:w="0"/>
-              <w:left w:type="dxa" w:w="0"/>
-              <w:bottom w:type="dxa" w:w="0"/>
-              <w:right w:type="dxa" w:w="0"/>
-            </w:tcMar>
-            <w:vAlign w:val="center"/>
-          </w:tcPr>
-          <w:p>
-            <w:pPr>
-              <w:spacing w:after="0" w:before="0" w:line="280"/>
-            </w:pPr>
-            <w:r>
-              <w:rPr>
-                <w:rFonts w:ascii="Calibri" w:cs="Calibri" w:eastAsia="Calibri" w:hAnsi="Calibri"/>
-                <w:b/>
-                <w:bCs/>
-                <w:color w:val="8A9E28"/>
-                <w:sz w:val="34"/>
-                <w:szCs w:val="34"/>
-              </w:rPr>
-              <w:t xml:space="preserve">Mercredi</w:t>
-            </w:r>
-          </w:p>
-        </w:tc>
-        <w:tc>
-          <w:tcPr>
-            <w:tcW w:type="dxa" w:w="4818"/>
-            <w:tcMar>
-              <w:top w:type="dxa" w:w="0"/>
-              <w:left w:type="dxa" w:w="0"/>
-              <w:bottom w:type="dxa" w:w="0"/>
-              <w:right w:type="dxa" w:w="0"/>
-            </w:tcMar>
-            <w:vAlign w:val="center"/>
-          </w:tcPr>
-          <w:p>
-            <w:pPr>
-              <w:spacing w:after="0" w:before="0" w:line="250"/>
-              <w:jc w:val="right"/>
-            </w:pPr>
-            <w:r>
-              <w:rPr>
-                <w:rFonts w:ascii="Calibri" w:cs="Calibri" w:eastAsia="Calibri" w:hAnsi="Calibri"/>
-                <w:color w:val="6E6E6E"/>
-                <w:sz w:val="19"/>
-                <w:szCs w:val="19"/>
-              </w:rPr>
-              <w:t xml:space="preserve">1 cours   ·   1 h   ·   6 élèves</w:t>
-            </w:r>
-          </w:p>
-        </w:tc>
-      </w:tr>
-    </w:tbl>
-    <w:p>
-      <w:pPr>
-        <w:spacing w:after="200" w:before="0" w:line="250"/>
-      </w:pPr>
-      <w:r>
-        <w:rPr>
-          <w:rFonts w:ascii="Calibri" w:cs="Calibri" w:eastAsia="Calibri" w:hAnsi="Calibri"/>
-          <w:color w:val="2E2E2E"/>
-          <w:sz w:val="8"/>
-          <w:szCs w:val="8"/>
-        </w:rPr>
-        <w:t xml:space="preserve"/>
-      </w:r>
-    </w:p>
-    <w:tbl>
-      <w:tblPr>
-        <w:tblW w:type="dxa" w:w="9637"/>
-        <w:tblBorders>
-          <w:top w:val="none" w:color="FFFFFF" w:sz="0"/>
-          <w:left w:val="none" w:color="FFFFFF" w:sz="0"/>
-          <w:bottom w:val="none" w:color="FFFFFF" w:sz="0"/>
-          <w:right w:val="none" w:color="FFFFFF" w:sz="0"/>
-          <w:insideH w:val="none" w:color="FFFFFF" w:sz="0"/>
-          <w:insideV w:val="none" w:color="FFFFFF" w:sz="0"/>
-        </w:tblBorders>
-      </w:tblPr>
-      <w:tblGrid>
-        <w:gridCol w:w="9637"/>
-      </w:tblGrid>
-      <w:tr>
-        <w:tc>
-          <w:tcPr>
-            <w:tcW w:type="dxa" w:w="9637"/>
-            <w:shd w:fill="8A9E28" w:color="auto" w:val="clear"/>
-            <w:tcMar>
-              <w:top w:type="dxa" w:w="85"/>
-              <w:left w:type="dxa" w:w="170"/>
-              <w:bottom w:type="dxa" w:w="85"/>
-              <w:right w:type="dxa" w:w="170"/>
-            </w:tcMar>
-            <w:vAlign w:val="center"/>
-          </w:tcPr>
-          <w:p>
-            <w:pPr>
-              <w:spacing w:after="0" w:before="0" w:line="250"/>
-            </w:pPr>
-            <w:r>
-              <w:rPr>
-                <w:rFonts w:ascii="Calibri" w:cs="Calibri" w:eastAsia="Calibri" w:hAnsi="Calibri"/>
-                <w:b/>
-                <w:bCs/>
-                <w:color w:val="FFFFFF"/>
-                <w:sz w:val="22"/>
-                <w:szCs w:val="22"/>
-              </w:rPr>
-              <w:t xml:space="preserve">15:00 – 16:00</w:t>
-            </w:r>
-            <w:r>
-              <w:rPr>
-                <w:rFonts w:ascii="Calibri" w:cs="Calibri" w:eastAsia="Calibri" w:hAnsi="Calibri"/>
-                <w:color w:val="FFFFFF"/>
-                <w:sz w:val="19"/>
-                <w:szCs w:val="19"/>
-              </w:rPr>
-              <w:t xml:space="preserve">      Terrain 1</w:t>
-            </w:r>
-            <w:r>
-              <w:rPr>
-                <w:rFonts w:ascii="Calibri" w:cs="Calibri" w:eastAsia="Calibri" w:hAnsi="Calibri"/>
-                <w:b/>
-                <w:bCs/>
-                <w:color w:val="FFFFFF"/>
-                <w:sz w:val="22"/>
-                <w:szCs w:val="22"/>
-              </w:rPr>
-              <w:t xml:space="preserve">      Bleu - Rouge</w:t>
-            </w:r>
-          </w:p>
-        </w:tc>
-      </w:tr>
-    </w:tbl>
-    <w:tbl>
-      <w:tblPr>
-        <w:tblW w:type="dxa" w:w="9637"/>
-        <w:tblBorders>
-          <w:top w:val="none" w:color="FFFFFF" w:sz="0"/>
-          <w:left w:val="none" w:color="FFFFFF" w:sz="0"/>
-          <w:bottom w:val="none" w:color="FFFFFF" w:sz="0"/>
-          <w:right w:val="none" w:color="FFFFFF" w:sz="0"/>
-          <w:insideH w:val="none" w:color="FFFFFF" w:sz="0"/>
-          <w:insideV w:val="none" w:color="FFFFFF" w:sz="0"/>
-        </w:tblBorders>
-      </w:tblPr>
-      <w:tblGrid>
-        <w:gridCol w:w="4818"/>
-        <w:gridCol w:w="4818"/>
-      </w:tblGrid>
-      <w:tr>
-        <w:trPr>
-          <w:trHeight w:val="317" w:hRule="atLeast"/>
-        </w:trPr>
-        <w:tc>
-          <w:tcPr>
-            <w:tcW w:type="dxa" w:w="4818"/>
-            <w:tcBorders>
-              <w:top w:val="none" w:color="FFFFFF" w:sz="0"/>
-              <w:left w:val="none" w:color="FFFFFF" w:sz="0"/>
-              <w:bottom w:val="none" w:color="FFFFFF" w:sz="0"/>
-              <w:right w:val="none" w:color="FFFFFF" w:sz="0"/>
-            </w:tcBorders>
-            <w:tcMar>
-              <w:top w:type="dxa" w:w="34"/>
-              <w:left w:type="dxa" w:w="226"/>
-              <w:bottom w:type="dxa" w:w="34"/>
-              <w:right w:type="dxa" w:w="113"/>
-            </w:tcMar>
-            <w:vAlign w:val="center"/>
-          </w:tcPr>
-          <w:p>
-            <w:pPr>
-              <w:spacing w:after="0" w:before="0" w:line="220"/>
-            </w:pPr>
-            <w:r>
-              <w:rPr>
-                <w:rFonts w:ascii="Calibri" w:cs="Calibri" w:eastAsia="Calibri" w:hAnsi="Calibri"/>
-                <w:color w:val="AAAAAA"/>
-                <w:sz w:val="17"/>
-                <w:szCs w:val="17"/>
-              </w:rPr>
-              <w:t xml:space="preserve">01.  </w:t>
-            </w:r>
-            <w:r>
-              <w:rPr>
-                <w:rFonts w:ascii="Calibri" w:cs="Calibri" w:eastAsia="Calibri" w:hAnsi="Calibri"/>
-                <w:color w:val="2E2E2E"/>
-                <w:sz w:val="19"/>
-                <w:szCs w:val="19"/>
-              </w:rPr>
-              <w:t xml:space="preserve">DAMBREMONT Hugo</w:t>
-            </w:r>
-            <w:r>
-              <w:rPr>
-                <w:rFonts w:ascii="Calibri" w:cs="Calibri" w:eastAsia="Calibri" w:hAnsi="Calibri"/>
-                <w:color w:val="6E6E6E"/>
-                <w:sz w:val="16"/>
-                <w:szCs w:val="16"/>
-              </w:rPr>
-              <w:t xml:space="preserve">   2020 · 6.3</w:t>
-            </w:r>
-          </w:p>
-        </w:tc>
-        <w:tc>
-          <w:tcPr>
-            <w:tcW w:type="dxa" w:w="4818"/>
-            <w:tcBorders>
-              <w:top w:val="none" w:color="FFFFFF" w:sz="0"/>
-              <w:left w:val="none" w:color="FFFFFF" w:sz="0"/>
-              <w:bottom w:val="none" w:color="FFFFFF" w:sz="0"/>
-              <w:right w:val="none" w:color="FFFFFF" w:sz="0"/>
-            </w:tcBorders>
-            <w:tcMar>
-              <w:top w:type="dxa" w:w="34"/>
-              <w:left w:type="dxa" w:w="226"/>
-              <w:bottom w:type="dxa" w:w="34"/>
-              <w:right w:type="dxa" w:w="113"/>
-            </w:tcMar>
-            <w:vAlign w:val="center"/>
-          </w:tcPr>
-          <w:p>
-            <w:pPr>
-              <w:spacing w:after="0" w:before="0" w:line="220"/>
-            </w:pPr>
-            <w:r>
-              <w:rPr>
-                <w:rFonts w:ascii="Calibri" w:cs="Calibri" w:eastAsia="Calibri" w:hAnsi="Calibri"/>
-                <w:color w:val="AAAAAA"/>
-                <w:sz w:val="17"/>
-                <w:szCs w:val="17"/>
-              </w:rPr>
-              <w:t xml:space="preserve">04.  </w:t>
-            </w:r>
-            <w:r>
-              <w:rPr>
-                <w:rFonts w:ascii="Calibri" w:cs="Calibri" w:eastAsia="Calibri" w:hAnsi="Calibri"/>
-                <w:color w:val="2E2E2E"/>
-                <w:sz w:val="19"/>
-                <w:szCs w:val="19"/>
-              </w:rPr>
-              <w:t xml:space="preserve">LESKO DAWES Louis</w:t>
-            </w:r>
-            <w:r>
-              <w:rPr>
-                <w:rFonts w:ascii="Calibri" w:cs="Calibri" w:eastAsia="Calibri" w:hAnsi="Calibri"/>
-                <w:color w:val="6E6E6E"/>
-                <w:sz w:val="16"/>
-                <w:szCs w:val="16"/>
-              </w:rPr>
-              <w:t xml:space="preserve">   2021 · 5.2</w:t>
-            </w:r>
-          </w:p>
-        </w:tc>
-      </w:tr>
-      <w:tr>
-        <w:trPr>
-          <w:trHeight w:val="317" w:hRule="atLeast"/>
-        </w:trPr>
-        <w:tc>
-          <w:tcPr>
-            <w:tcW w:type="dxa" w:w="4818"/>
-            <w:tcBorders>
-              <w:top w:val="none" w:color="FFFFFF" w:sz="0"/>
-              <w:left w:val="none" w:color="FFFFFF" w:sz="0"/>
-              <w:bottom w:val="none" w:color="FFFFFF" w:sz="0"/>
-              <w:right w:val="none" w:color="FFFFFF" w:sz="0"/>
-            </w:tcBorders>
-            <w:tcMar>
-              <w:top w:type="dxa" w:w="34"/>
-              <w:left w:type="dxa" w:w="226"/>
-              <w:bottom w:type="dxa" w:w="34"/>
-              <w:right w:type="dxa" w:w="113"/>
-            </w:tcMar>
-            <w:vAlign w:val="center"/>
-          </w:tcPr>
-          <w:p>
-            <w:pPr>
-              <w:spacing w:after="0" w:before="0" w:line="220"/>
-            </w:pPr>
-            <w:r>
-              <w:rPr>
-                <w:rFonts w:ascii="Calibri" w:cs="Calibri" w:eastAsia="Calibri" w:hAnsi="Calibri"/>
-                <w:color w:val="AAAAAA"/>
-                <w:sz w:val="17"/>
-                <w:szCs w:val="17"/>
-              </w:rPr>
-              <w:t xml:space="preserve">02.  </w:t>
-            </w:r>
-            <w:r>
-              <w:rPr>
-                <w:rFonts w:ascii="Calibri" w:cs="Calibri" w:eastAsia="Calibri" w:hAnsi="Calibri"/>
-                <w:color w:val="2E2E2E"/>
-                <w:sz w:val="19"/>
-                <w:szCs w:val="19"/>
-              </w:rPr>
-              <w:t xml:space="preserve">GÉRARD Théodore</w:t>
-            </w:r>
-            <w:r>
-              <w:rPr>
-                <w:rFonts w:ascii="Calibri" w:cs="Calibri" w:eastAsia="Calibri" w:hAnsi="Calibri"/>
-                <w:color w:val="6E6E6E"/>
-                <w:sz w:val="16"/>
-                <w:szCs w:val="16"/>
-              </w:rPr>
-              <w:t xml:space="preserve">   2020 · 6.5</w:t>
-            </w:r>
-          </w:p>
-        </w:tc>
-        <w:tc>
-          <w:tcPr>
-            <w:tcW w:type="dxa" w:w="4818"/>
-            <w:tcBorders>
-              <w:top w:val="none" w:color="FFFFFF" w:sz="0"/>
-              <w:left w:val="none" w:color="FFFFFF" w:sz="0"/>
-              <w:bottom w:val="none" w:color="FFFFFF" w:sz="0"/>
-              <w:right w:val="none" w:color="FFFFFF" w:sz="0"/>
-            </w:tcBorders>
-            <w:tcMar>
-              <w:top w:type="dxa" w:w="34"/>
-              <w:left w:type="dxa" w:w="226"/>
-              <w:bottom w:type="dxa" w:w="34"/>
-              <w:right w:type="dxa" w:w="113"/>
-            </w:tcMar>
-            <w:vAlign w:val="center"/>
-          </w:tcPr>
-          <w:p>
-            <w:pPr>
-              <w:spacing w:after="0" w:before="0" w:line="220"/>
-            </w:pPr>
-            <w:r>
-              <w:rPr>
-                <w:rFonts w:ascii="Calibri" w:cs="Calibri" w:eastAsia="Calibri" w:hAnsi="Calibri"/>
-                <w:color w:val="AAAAAA"/>
-                <w:sz w:val="17"/>
-                <w:szCs w:val="17"/>
-              </w:rPr>
-              <w:t xml:space="preserve">05.  </w:t>
-            </w:r>
-            <w:r>
-              <w:rPr>
-                <w:rFonts w:ascii="Calibri" w:cs="Calibri" w:eastAsia="Calibri" w:hAnsi="Calibri"/>
-                <w:color w:val="2E2E2E"/>
-                <w:sz w:val="19"/>
-                <w:szCs w:val="19"/>
-              </w:rPr>
-              <w:t xml:space="preserve">OZKAN Milan</w:t>
-            </w:r>
-            <w:r>
-              <w:rPr>
-                <w:rFonts w:ascii="Calibri" w:cs="Calibri" w:eastAsia="Calibri" w:hAnsi="Calibri"/>
-                <w:color w:val="6E6E6E"/>
-                <w:sz w:val="16"/>
-                <w:szCs w:val="16"/>
-              </w:rPr>
-              <w:t xml:space="preserve">   2021 · 5</w:t>
-            </w:r>
-          </w:p>
-        </w:tc>
-      </w:tr>
-      <w:tr>
-        <w:trPr>
-          <w:trHeight w:val="317" w:hRule="atLeast"/>
-        </w:trPr>
-        <w:tc>
-          <w:tcPr>
-            <w:tcW w:type="dxa" w:w="4818"/>
-            <w:tcBorders>
-              <w:top w:val="none" w:color="FFFFFF" w:sz="0"/>
-              <w:left w:val="none" w:color="FFFFFF" w:sz="0"/>
-              <w:bottom w:val="none" w:color="FFFFFF" w:sz="0"/>
-              <w:right w:val="none" w:color="FFFFFF" w:sz="0"/>
-            </w:tcBorders>
-            <w:tcMar>
-              <w:top w:type="dxa" w:w="34"/>
-              <w:left w:type="dxa" w:w="226"/>
-              <w:bottom w:type="dxa" w:w="34"/>
-              <w:right w:type="dxa" w:w="113"/>
-            </w:tcMar>
-            <w:vAlign w:val="center"/>
-          </w:tcPr>
-          <w:p>
-            <w:pPr>
-              <w:spacing w:after="0" w:before="0" w:line="220"/>
-            </w:pPr>
-            <w:r>
-              <w:rPr>
-                <w:rFonts w:ascii="Calibri" w:cs="Calibri" w:eastAsia="Calibri" w:hAnsi="Calibri"/>
-                <w:color w:val="AAAAAA"/>
-                <w:sz w:val="17"/>
-                <w:szCs w:val="17"/>
-              </w:rPr>
-              <w:t xml:space="preserve">03.  </w:t>
-            </w:r>
-            <w:r>
-              <w:rPr>
-                <w:rFonts w:ascii="Calibri" w:cs="Calibri" w:eastAsia="Calibri" w:hAnsi="Calibri"/>
-                <w:color w:val="2E2E2E"/>
-                <w:sz w:val="19"/>
-                <w:szCs w:val="19"/>
-              </w:rPr>
-              <w:t xml:space="preserve">HEIERE Lotte</w:t>
-            </w:r>
-            <w:r>
-              <w:rPr>
-                <w:rFonts w:ascii="Calibri" w:cs="Calibri" w:eastAsia="Calibri" w:hAnsi="Calibri"/>
-                <w:color w:val="6E6E6E"/>
-                <w:sz w:val="16"/>
-                <w:szCs w:val="16"/>
-              </w:rPr>
-              <w:t xml:space="preserve">   2020 · 6.3</w:t>
-            </w:r>
-          </w:p>
-        </w:tc>
-        <w:tc>
-          <w:tcPr>
-            <w:tcW w:type="dxa" w:w="4818"/>
-            <w:tcBorders>
-              <w:top w:val="none" w:color="FFFFFF" w:sz="0"/>
-              <w:left w:val="none" w:color="FFFFFF" w:sz="0"/>
-              <w:bottom w:val="none" w:color="FFFFFF" w:sz="0"/>
-              <w:right w:val="none" w:color="FFFFFF" w:sz="0"/>
-            </w:tcBorders>
-            <w:tcMar>
-              <w:top w:type="dxa" w:w="34"/>
-              <w:left w:type="dxa" w:w="226"/>
-              <w:bottom w:type="dxa" w:w="34"/>
-              <w:right w:type="dxa" w:w="113"/>
-            </w:tcMar>
-            <w:vAlign w:val="center"/>
-          </w:tcPr>
-          <w:p>
-            <w:pPr>
-              <w:spacing w:after="0" w:before="0" w:line="220"/>
-            </w:pPr>
-            <w:r>
-              <w:rPr>
-                <w:rFonts w:ascii="Calibri" w:cs="Calibri" w:eastAsia="Calibri" w:hAnsi="Calibri"/>
-                <w:color w:val="AAAAAA"/>
-                <w:sz w:val="17"/>
-                <w:szCs w:val="17"/>
-              </w:rPr>
-              <w:t xml:space="preserve">06.  </w:t>
-            </w:r>
-            <w:r>
-              <w:rPr>
-                <w:rFonts w:ascii="Calibri" w:cs="Calibri" w:eastAsia="Calibri" w:hAnsi="Calibri"/>
-                <w:color w:val="2E2E2E"/>
-                <w:sz w:val="19"/>
-                <w:szCs w:val="19"/>
-              </w:rPr>
-              <w:t xml:space="preserve">PANAGOPULOS Foteini</w:t>
-            </w:r>
-            <w:r>
-              <w:rPr>
-                <w:rFonts w:ascii="Calibri" w:cs="Calibri" w:eastAsia="Calibri" w:hAnsi="Calibri"/>
-                <w:color w:val="6E6E6E"/>
-                <w:sz w:val="16"/>
-                <w:szCs w:val="16"/>
-              </w:rPr>
-              <w:t xml:space="preserve">   2021 · 5</w:t>
-            </w:r>
-          </w:p>
-        </w:tc>
-      </w:tr>
-    </w:tbl>
-    <w:p>
-      <w:pPr>
-        <w:spacing w:after="190" w:before="0" w:line="250"/>
-      </w:pPr>
-      <w:r>
-        <w:rPr>
-          <w:rFonts w:ascii="Calibri" w:cs="Calibri" w:eastAsia="Calibri" w:hAnsi="Calibri"/>
-          <w:color w:val="2E2E2E"/>
-          <w:sz w:val="10"/>
-          <w:szCs w:val="10"/>
-        </w:rPr>
-        <w:t xml:space="preserve"/>
-      </w:r>
-    </w:p>
     <w:sectPr>
       <w:footerReference w:type="default" r:id="rId7"/>
       <w:pgSz w:w="11906" w:h="16838" w:orient="portrait"/>
@@ -1895,7 +1250,7 @@
         <w:sz w:val="15"/>
         <w:szCs w:val="15"/>
       </w:rPr>
-      <w:t xml:space="preserve">Armelle Tiokou  ·  3 cours  ·  3 h par semaine  ·  Saison 2026-2027</w:t>
+      <w:t xml:space="preserve">Armelle Tiokou  ·  2 cours  ·  2 h par semaine  ·  Saison 2026-2027</w:t>
     </w:r>
   </w:p>
 </w:ftr>

</xml_diff>